<commit_message>
feature/000: Updated word handover doc
</commit_message>
<xml_diff>
--- a/docs/MEDSYS_Client_Handover_Review.docx
+++ b/docs/MEDSYS_Client_Handover_Review.docx
@@ -20,7 +20,7 @@
     </w:p>
     <w:p>
       <w:r>
-        <w:t xml:space="preserve">Project Code: `MEDLINK-Version2` Target Audience: All Medical Field Professionals Document Version: `1.1` System Reference Date: April 5, 2026 Status: Tech Manager Review Draft</w:t>
+        <w:t xml:space="preserve">Project Code: `MEDLINK-Version2` Target Audience: All Medical Field Professionals Document Version: `1.2` System Reference Date: April 6, 2026 Status: Tech Manager Review Draft</w:t>
       </w:r>
     </w:p>
     <w:p>
@@ -92,7 +92,7 @@
         <w:pStyle w:val="ListParagraph"/>
       </w:pPr>
       <w:r>
-        <w:t xml:space="preserve">• inventory now supports alerts, restock recommendations, and explicit base-unit plus packaging-conversion metadata</w:t>
+        <w:t xml:space="preserve">• inventory now supports alerts, restock recommendations, explicit base-unit plus packaging-conversion metadata, batch tracking, stock-adjustment endpoints, and reporting summaries</w:t>
       </w:r>
     </w:p>
     <w:p>
@@ -217,7 +217,7 @@
           </w:tcPr>
           <w:p>
             <w:r>
-              <w:t xml:space="preserve">1.1</w:t>
+              <w:t xml:space="preserve">1.2</w:t>
             </w:r>
           </w:p>
         </w:tc>
@@ -239,7 +239,7 @@
           </w:tcPr>
           <w:p>
             <w:r>
-              <w:t xml:space="preserve">April 5, 2026</w:t>
+              <w:t xml:space="preserve">April 6, 2026</w:t>
             </w:r>
           </w:p>
         </w:tc>
@@ -433,6 +433,38 @@
           </w:p>
         </w:tc>
       </w:tr>
+      <w:tr>
+        <w:tc>
+          <w:tcPr>
+            <w:tcW w:w="2400" w:type="dxa"/>
+          </w:tcPr>
+          <w:p>
+            <w:r>
+              <w:t xml:space="preserve">1.2</w:t>
+            </w:r>
+          </w:p>
+        </w:tc>
+        <w:tc>
+          <w:tcPr>
+            <w:tcW w:w="2400" w:type="dxa"/>
+          </w:tcPr>
+          <w:p>
+            <w:r>
+              <w:t xml:space="preserve">April 6, 2026</w:t>
+            </w:r>
+          </w:p>
+        </w:tc>
+        <w:tc>
+          <w:tcPr>
+            <w:tcW w:w="2400" w:type="dxa"/>
+          </w:tcPr>
+          <w:p>
+            <w:r>
+              <w:t xml:space="preserve">Added inventory movement conversion responses, stock-adjust endpoint, batch tracking, and inventory reports</w:t>
+            </w:r>
+          </w:p>
+        </w:tc>
+      </w:tr>
     </w:tbl>
     <w:p/>
     <w:p>
@@ -917,6 +949,22 @@
         <w:pStyle w:val="ListParagraph"/>
       </w:pPr>
       <w:r>
+        <w:t xml:space="preserve">• inventory stock adjustment through `POST /v1/inventory/:id/adjust-stock`</w:t>
+      </w:r>
+    </w:p>
+    <w:p>
+      <w:pPr>
+        <w:pStyle w:val="ListParagraph"/>
+      </w:pPr>
+      <w:r>
+        <w:t xml:space="preserve">• inventory batch tracking through `GET /v1/inventory/:id/batches` and `POST /v1/inventory/:id/batches`</w:t>
+      </w:r>
+    </w:p>
+    <w:p>
+      <w:pPr>
+        <w:pStyle w:val="ListParagraph"/>
+      </w:pPr>
+      <w:r>
         <w:t xml:space="preserve">• inventory alerts and reorder suggestions through `GET /v1/inventory/alerts`</w:t>
       </w:r>
     </w:p>
@@ -925,6 +973,14 @@
         <w:pStyle w:val="ListParagraph"/>
       </w:pPr>
       <w:r>
+        <w:t xml:space="preserve">• inventory operational reporting through `GET /v1/inventory/reports`</w:t>
+      </w:r>
+    </w:p>
+    <w:p>
+      <w:pPr>
+        <w:pStyle w:val="ListParagraph"/>
+      </w:pPr>
+      <w:r>
         <w:t xml:space="preserve">• backend-computed `stockStatus`</w:t>
       </w:r>
     </w:p>
@@ -934,6 +990,14 @@
       </w:pPr>
       <w:r>
         <w:t xml:space="preserve">• explicit packaging-conversion fields for dispense and purchase workflows</w:t>
+      </w:r>
+    </w:p>
+    <w:p>
+      <w:pPr>
+        <w:pStyle w:val="ListParagraph"/>
+      </w:pPr>
+      <w:r>
+        <w:t xml:space="preserve">• backend-computed `stockSummary`, movement conversion payloads, and supplier or expiry reporting helpers</w:t>
       </w:r>
     </w:p>
     <w:p>
@@ -1651,7 +1715,7 @@
           </w:tcPr>
           <w:p>
             <w:r>
-              <w:t xml:space="preserve">`/v1/inventory`, `/v1/inventory/search`, `/v1/inventory/alerts`, `/v1/inventory/:id/movements`</w:t>
+              <w:t xml:space="preserve">`/v1/inventory`, `/v1/inventory/:id`, `/v1/inventory/search`, `/v1/inventory/alerts`, `/v1/inventory/reports`, `/v1/inventory/:id/movements`, `/v1/inventory/:id/adjust-stock`, `/v1/inventory/:id/batches`</w:t>
             </w:r>
           </w:p>
         </w:tc>
@@ -1794,6 +1858,22 @@
     </w:p>
     <w:p>
       <w:pPr>
+        <w:pStyle w:val="ListParagraph"/>
+      </w:pPr>
+      <w:r>
+        <w:t xml:space="preserve">• Stock count correction = `POST /v1/inventory/:id/adjust-stock`</w:t>
+      </w:r>
+    </w:p>
+    <w:p>
+      <w:pPr>
+        <w:pStyle w:val="ListParagraph"/>
+      </w:pPr>
+      <w:r>
+        <w:t xml:space="preserve">• Batch receipt and expiry tracking = `POST /v1/inventory/:id/batches`</w:t>
+      </w:r>
+    </w:p>
+    <w:p>
+      <w:pPr>
         <w:pStyle w:val="Heading3"/>
       </w:pPr>
       <w:r>
@@ -2092,6 +2172,30 @@
       </w:r>
     </w:p>
     <w:p>
+      <w:pPr>
+        <w:pStyle w:val="ListParagraph"/>
+      </w:pPr>
+      <w:r>
+        <w:t xml:space="preserve">• `Short by`</w:t>
+      </w:r>
+    </w:p>
+    <w:p>
+      <w:pPr>
+        <w:pStyle w:val="ListParagraph"/>
+      </w:pPr>
+      <w:r>
+        <w:t xml:space="preserve">• `Purchase Pack Equivalent`</w:t>
+      </w:r>
+    </w:p>
+    <w:p>
+      <w:pPr>
+        <w:pStyle w:val="ListParagraph"/>
+      </w:pPr>
+      <w:r>
+        <w:t xml:space="preserve">• `Dispense Pack Equivalent`</w:t>
+      </w:r>
+    </w:p>
+    <w:p>
       <w:r>
         <w:t xml:space="preserve">Recommended display rules:</w:t>
       </w:r>
@@ -2117,7 +2221,23 @@
         <w:pStyle w:val="ListParagraph"/>
       </w:pPr>
       <w:r>
-        <w:t xml:space="preserve">• when users want to set the actual counted stock, frontend should calculate the difference and send a stock movement with reason `adjustment`</w:t>
+        <w:t xml:space="preserve">• when users want to set the actual counted stock, frontend should call `POST /v1/inventory/:id/adjust-stock`</w:t>
+      </w:r>
+    </w:p>
+    <w:p>
+      <w:pPr>
+        <w:pStyle w:val="ListParagraph"/>
+      </w:pPr>
+      <w:r>
+        <w:t xml:space="preserve">• movement requests may now send `movementUnit` such as `tablet`, `card`, or `box`; backend converts to base stock automatically</w:t>
+      </w:r>
+    </w:p>
+    <w:p>
+      <w:pPr>
+        <w:pStyle w:val="ListParagraph"/>
+      </w:pPr>
+      <w:r>
+        <w:t xml:space="preserve">• inventory detail and list responses now include `stockSummary`, so frontend should render backend values instead of recalculating shortage or pack equivalents</w:t>
       </w:r>
     </w:p>
     <w:p>
@@ -2224,6 +2344,165 @@
       </w:pPr>
       <w:r>
         <w:t xml:space="preserve">• equivalent to `10 boxes`</w:t>
+      </w:r>
+    </w:p>
+    <w:p>
+      <w:r>
+        <w:t xml:space="preserve">Movement response shape now includes conversion details:</w:t>
+      </w:r>
+    </w:p>
+    <w:p>
+      <w:pPr>
+        <w:pStyle w:val="Code"/>
+      </w:pPr>
+      <w:r>
+        <w:t xml:space="preserve">{</w:t>
+      </w:r>
+    </w:p>
+    <w:p>
+      <w:pPr>
+        <w:pStyle w:val="Code"/>
+      </w:pPr>
+      <w:r>
+        <w:t xml:space="preserve">  "movement": {},</w:t>
+      </w:r>
+    </w:p>
+    <w:p>
+      <w:pPr>
+        <w:pStyle w:val="Code"/>
+      </w:pPr>
+      <w:r>
+        <w:t xml:space="preserve">  "item": {</w:t>
+      </w:r>
+    </w:p>
+    <w:p>
+      <w:pPr>
+        <w:pStyle w:val="Code"/>
+      </w:pPr>
+      <w:r>
+        <w:t xml:space="preserve">    "stock": "490",</w:t>
+      </w:r>
+    </w:p>
+    <w:p>
+      <w:pPr>
+        <w:pStyle w:val="Code"/>
+      </w:pPr>
+      <w:r>
+        <w:t xml:space="preserve">    "stockSummary": {}</w:t>
+      </w:r>
+    </w:p>
+    <w:p>
+      <w:pPr>
+        <w:pStyle w:val="Code"/>
+      </w:pPr>
+      <w:r>
+        <w:t xml:space="preserve">  },</w:t>
+      </w:r>
+    </w:p>
+    <w:p>
+      <w:pPr>
+        <w:pStyle w:val="Code"/>
+      </w:pPr>
+      <w:r>
+        <w:t xml:space="preserve">  "conversion": {</w:t>
+      </w:r>
+    </w:p>
+    <w:p>
+      <w:pPr>
+        <w:pStyle w:val="Code"/>
+      </w:pPr>
+      <w:r>
+        <w:t xml:space="preserve">    "requestedQuantity": "2",</w:t>
+      </w:r>
+    </w:p>
+    <w:p>
+      <w:pPr>
+        <w:pStyle w:val="Code"/>
+      </w:pPr>
+      <w:r>
+        <w:t xml:space="preserve">    "requestedUnit": "carton",</w:t>
+      </w:r>
+    </w:p>
+    <w:p>
+      <w:pPr>
+        <w:pStyle w:val="Code"/>
+      </w:pPr>
+      <w:r>
+        <w:t xml:space="preserve">    "baseQuantity": "480",</w:t>
+      </w:r>
+    </w:p>
+    <w:p>
+      <w:pPr>
+        <w:pStyle w:val="Code"/>
+      </w:pPr>
+      <w:r>
+        <w:t xml:space="preserve">    "baseUnit": "tablet"</w:t>
+      </w:r>
+    </w:p>
+    <w:p>
+      <w:pPr>
+        <w:pStyle w:val="Code"/>
+      </w:pPr>
+      <w:r>
+        <w:t xml:space="preserve">  }</w:t>
+      </w:r>
+    </w:p>
+    <w:p>
+      <w:pPr>
+        <w:pStyle w:val="Code"/>
+      </w:pPr>
+      <w:r>
+        <w:t xml:space="preserve">}</w:t>
+      </w:r>
+    </w:p>
+    <w:p>
+      <w:r>
+        <w:t xml:space="preserve">Inventory detail now supports:</w:t>
+      </w:r>
+    </w:p>
+    <w:p>
+      <w:pPr>
+        <w:pStyle w:val="ListParagraph"/>
+      </w:pPr>
+      <w:r>
+        <w:t xml:space="preserve">• `GET /v1/inventory/:id`</w:t>
+      </w:r>
+    </w:p>
+    <w:p>
+      <w:pPr>
+        <w:pStyle w:val="ListParagraph"/>
+      </w:pPr>
+      <w:r>
+        <w:t xml:space="preserve">• `GET /v1/inventory/:id/batches`</w:t>
+      </w:r>
+    </w:p>
+    <w:p>
+      <w:r>
+        <w:t xml:space="preserve">Inventory reports now support:</w:t>
+      </w:r>
+    </w:p>
+    <w:p>
+      <w:pPr>
+        <w:pStyle w:val="ListParagraph"/>
+      </w:pPr>
+      <w:r>
+        <w:t xml:space="preserve">• supplier summary</w:t>
+      </w:r>
+    </w:p>
+    <w:p>
+      <w:pPr>
+        <w:pStyle w:val="ListParagraph"/>
+      </w:pPr>
+      <w:r>
+        <w:t xml:space="preserve">• fast-moving, slow-moving, and dead-stock sections</w:t>
+      </w:r>
+    </w:p>
+    <w:p>
+      <w:pPr>
+        <w:pStyle w:val="ListParagraph"/>
+      </w:pPr>
+      <w:r>
+        <w:t xml:space="preserve">• expiring batch monitoring</w:t>
       </w:r>
     </w:p>
     <w:p/>
@@ -2694,7 +2973,7 @@
         <w:pStyle w:val="ListParagraph"/>
       </w:pPr>
       <w:r>
-        <w:t xml:space="preserve">• inventory alerts, packaging conversion fields, and stock-movement-only quantity updates</w:t>
+        <w:t xml:space="preserve">• inventory alerts, packaging conversion fields, stock-movement-only quantity updates, stock-adjust workflow, batch tracking, and inventory reporting</w:t>
       </w:r>
     </w:p>
     <w:p>
@@ -2763,7 +3042,7 @@
         <w:pStyle w:val="ListParagraph"/>
       </w:pPr>
       <w:r>
-        <w:t xml:space="preserve">• 91 API tests passing at the time of this document</w:t>
+        <w:t xml:space="preserve">• 92 API tests passing at the time of this document</w:t>
       </w:r>
     </w:p>
     <w:p/>

</xml_diff>

<commit_message>
feature/000: Updated Handover Word doc
</commit_message>
<xml_diff>
--- a/docs/MEDSYS_Client_Handover_Review.docx
+++ b/docs/MEDSYS_Client_Handover_Review.docx
@@ -2196,6 +2196,176 @@
       </w:r>
     </w:p>
     <w:p>
+      <w:pPr>
+        <w:pStyle w:val="Heading3"/>
+      </w:pPr>
+      <w:r>
+        <w:t xml:space="preserve">Inventory Actions In Simple Terms</w:t>
+      </w:r>
+    </w:p>
+    <w:p>
+      <w:r>
+        <w:t xml:space="preserve">For doctor and assistant users, the inventory flow should be explained in operational language:</w:t>
+      </w:r>
+    </w:p>
+    <w:p>
+      <w:pPr>
+        <w:pStyle w:val="ListParagraph"/>
+      </w:pPr>
+      <w:r>
+        <w:t xml:space="preserve">• `Edit Item Details`</w:t>
+      </w:r>
+    </w:p>
+    <w:p>
+      <w:pPr>
+        <w:pStyle w:val="ListParagraph"/>
+      </w:pPr>
+      <w:r>
+        <w:t xml:space="preserve">• change the item name, supplier, packaging setup, minimum stock level, and notes</w:t>
+      </w:r>
+    </w:p>
+    <w:p>
+      <w:pPr>
+        <w:pStyle w:val="ListParagraph"/>
+      </w:pPr>
+      <w:r>
+        <w:t xml:space="preserve">• `Add Stock`</w:t>
+      </w:r>
+    </w:p>
+    <w:p>
+      <w:pPr>
+        <w:pStyle w:val="ListParagraph"/>
+      </w:pPr>
+      <w:r>
+        <w:t xml:space="preserve">• record newly received stock</w:t>
+      </w:r>
+    </w:p>
+    <w:p>
+      <w:pPr>
+        <w:pStyle w:val="ListParagraph"/>
+      </w:pPr>
+      <w:r>
+        <w:t xml:space="preserve">• `Remove Stock`</w:t>
+      </w:r>
+    </w:p>
+    <w:p>
+      <w:pPr>
+        <w:pStyle w:val="ListParagraph"/>
+      </w:pPr>
+      <w:r>
+        <w:t xml:space="preserve">• record stock that was used, dispensed, damaged, or expired</w:t>
+      </w:r>
+    </w:p>
+    <w:p>
+      <w:pPr>
+        <w:pStyle w:val="ListParagraph"/>
+      </w:pPr>
+      <w:r>
+        <w:t xml:space="preserve">• `Correct Stock Count`</w:t>
+      </w:r>
+    </w:p>
+    <w:p>
+      <w:pPr>
+        <w:pStyle w:val="ListParagraph"/>
+      </w:pPr>
+      <w:r>
+        <w:t xml:space="preserve">• set the system to the real counted quantity when physical stock and system stock do not match</w:t>
+      </w:r>
+    </w:p>
+    <w:p>
+      <w:pPr>
+        <w:pStyle w:val="ListParagraph"/>
+      </w:pPr>
+      <w:r>
+        <w:t xml:space="preserve">• `Add Batch`</w:t>
+      </w:r>
+    </w:p>
+    <w:p>
+      <w:pPr>
+        <w:pStyle w:val="ListParagraph"/>
+      </w:pPr>
+      <w:r>
+        <w:t xml:space="preserve">• record a new lot or batch with its own expiry date and storage location</w:t>
+      </w:r>
+    </w:p>
+    <w:p>
+      <w:pPr>
+        <w:pStyle w:val="Heading3"/>
+      </w:pPr>
+      <w:r>
+        <w:t xml:space="preserve">Operational Language Guide</w:t>
+      </w:r>
+    </w:p>
+    <w:p>
+      <w:r>
+        <w:t xml:space="preserve">Recommended business wording for non-technical users:</w:t>
+      </w:r>
+    </w:p>
+    <w:p>
+      <w:pPr>
+        <w:pStyle w:val="ListParagraph"/>
+      </w:pPr>
+      <w:r>
+        <w:t xml:space="preserve">• `movementUnit` -&gt; `Stock Unit Used`</w:t>
+      </w:r>
+    </w:p>
+    <w:p>
+      <w:pPr>
+        <w:pStyle w:val="ListParagraph"/>
+      </w:pPr>
+      <w:r>
+        <w:t xml:space="preserve">• `adjust-stock` -&gt; `Correct Stock Count`</w:t>
+      </w:r>
+    </w:p>
+    <w:p>
+      <w:pPr>
+        <w:pStyle w:val="ListParagraph"/>
+      </w:pPr>
+      <w:r>
+        <w:t xml:space="preserve">• `stockSummary.currentStock` -&gt; `Current Stock`</w:t>
+      </w:r>
+    </w:p>
+    <w:p>
+      <w:pPr>
+        <w:pStyle w:val="ListParagraph"/>
+      </w:pPr>
+      <w:r>
+        <w:t xml:space="preserve">• `stockSummary.minimumStock` -&gt; `Minimum Stock Level`</w:t>
+      </w:r>
+    </w:p>
+    <w:p>
+      <w:pPr>
+        <w:pStyle w:val="ListParagraph"/>
+      </w:pPr>
+      <w:r>
+        <w:t xml:space="preserve">• `stockSummary.shortageToMinimum` -&gt; `Short by`</w:t>
+      </w:r>
+    </w:p>
+    <w:p>
+      <w:pPr>
+        <w:pStyle w:val="ListParagraph"/>
+      </w:pPr>
+      <w:r>
+        <w:t xml:space="preserve">• `stockSummary.purchasePackEquivalent` -&gt; `Equivalent Purchase Packs`</w:t>
+      </w:r>
+    </w:p>
+    <w:p>
+      <w:pPr>
+        <w:pStyle w:val="ListParagraph"/>
+      </w:pPr>
+      <w:r>
+        <w:t xml:space="preserve">• `stockSummary.dispensePackEquivalent` -&gt; `Equivalent Dispense Packs`</w:t>
+      </w:r>
+    </w:p>
+    <w:p>
+      <w:pPr>
+        <w:pStyle w:val="ListParagraph"/>
+      </w:pPr>
+      <w:r>
+        <w:t xml:space="preserve">• `inventory reports` -&gt; `Inventory Summary and Warnings`</w:t>
+      </w:r>
+    </w:p>
+    <w:p>
       <w:r>
         <w:t xml:space="preserve">Recommended display rules:</w:t>
       </w:r>
@@ -2344,6 +2514,51 @@
       </w:pPr>
       <w:r>
         <w:t xml:space="preserve">• equivalent to `10 boxes`</w:t>
+      </w:r>
+    </w:p>
+    <w:p>
+      <w:r>
+        <w:t xml:space="preserve">Simple examples for staff-facing screens:</w:t>
+      </w:r>
+    </w:p>
+    <w:p>
+      <w:pPr>
+        <w:pStyle w:val="ListParagraph"/>
+      </w:pPr>
+      <w:r>
+        <w:t xml:space="preserve">• `Current Stock: 200 tablets`</w:t>
+      </w:r>
+    </w:p>
+    <w:p>
+      <w:pPr>
+        <w:pStyle w:val="ListParagraph"/>
+      </w:pPr>
+      <w:r>
+        <w:t xml:space="preserve">• `Minimum Stock Level: 50 tablets`</w:t>
+      </w:r>
+    </w:p>
+    <w:p>
+      <w:pPr>
+        <w:pStyle w:val="ListParagraph"/>
+      </w:pPr>
+      <w:r>
+        <w:t xml:space="preserve">• `Short by: 10 tablets`</w:t>
+      </w:r>
+    </w:p>
+    <w:p>
+      <w:pPr>
+        <w:pStyle w:val="ListParagraph"/>
+      </w:pPr>
+      <w:r>
+        <w:t xml:space="preserve">• `If 2 boxes are received and 1 box = 100 tablets, the system adds 200 tablets automatically.`</w:t>
+      </w:r>
+    </w:p>
+    <w:p>
+      <w:pPr>
+        <w:pStyle w:val="ListParagraph"/>
+      </w:pPr>
+      <w:r>
+        <w:t xml:space="preserve">• `If physical counted stock is 180, staff should use Correct Stock Count instead of manually calculating the difference.`</w:t>
       </w:r>
     </w:p>
     <w:p>

</xml_diff>